<commit_message>
feat(fevrier): livrable de fevrier (Sauvegarde et Chargement)
</commit_message>
<xml_diff>
--- a/ressources/Rapports Mensuels/Séquenceur Novembre.docx
+++ b/ressources/Rapports Mensuels/Séquenceur Novembre.docx
@@ -19,27 +19,27 @@
         <w:rPr>
           <w:lang w:val="fr-FR"/>
         </w:rPr>
-        <w:t>janvier</w:t>
-      </w:r>
-    </w:p>
-    <w:p>
-      <w:pPr>
-        <w:rPr>
-          <w:lang w:val="fr-FR"/>
-        </w:rPr>
-      </w:pPr>
-    </w:p>
-    <w:p>
-      <w:pPr>
-        <w:rPr>
-          <w:lang w:val="fr-FR"/>
-        </w:rPr>
-      </w:pPr>
-      <w:r>
-        <w:rPr>
-          <w:lang w:val="fr-FR"/>
-        </w:rPr>
-        <w:t>Conformément à la conclusion du rapport de décembre, le mois de janvier était dédié à la résolution de la limitation technique majeure du prototype : la gestion de la polyphonie. L'objectif principal était de développer une synchronisation audio parfaite entre les pistes pour éviter les coupures de son lors des chevauchements. En parallèle, le planning prévoyait l'amélioration de l'interface graphique via l'ajout d'un retour visuel dynamique (curseur de lecture) pour faciliter le repérage dans la grille rythmique.</w:t>
+        <w:t>février</w:t>
+      </w:r>
+    </w:p>
+    <w:p>
+      <w:pPr>
+        <w:rPr>
+          <w:lang w:val="fr-FR"/>
+        </w:rPr>
+      </w:pPr>
+    </w:p>
+    <w:p>
+      <w:pPr>
+        <w:rPr>
+          <w:lang w:val="fr-FR"/>
+        </w:rPr>
+      </w:pPr>
+      <w:r>
+        <w:rPr>
+          <w:lang w:val="fr-FR"/>
+        </w:rPr>
+        <w:t>Conformément à la conclusion du rapport de janvier, l'étape suivante prévue au cahier des charges était la persistance des données. Le mois de février a donc été intégralement consacré à l'implémentation de la sauvegarde et du chargement des projets au format JSON, afin de permettre à l'utilisateur de conserver ses créations et compositions. Le moteur audio asynchrone et l'interface étant désormais stables, cette étape était cruciale pour transformer le prototype en un véritable logiciel utilitaire.</w:t>
       </w:r>
     </w:p>
     <w:p>
@@ -53,140 +53,136 @@
         <w:rPr>
           <w:lang w:val="fr-FR"/>
         </w:rPr>
-        <w:t>Refonte du moteur audio</w:t>
-      </w:r>
-    </w:p>
-    <w:p>
-      <w:pPr>
-        <w:rPr>
-          <w:lang w:val="fr-FR"/>
-        </w:rPr>
-      </w:pPr>
-      <w:r>
-        <w:rPr>
-          <w:lang w:val="fr-FR"/>
-        </w:rPr>
-        <w:t>Pour dépasser les limitations de la lecture séquentielle simple observées en décembre (coupure du son précédent lors d'un nouveau déclenchement), j'ai procédé à une refonte complète du cœur audio (</w:t>
-      </w:r>
-      <w:proofErr w:type="spellStart"/>
-      <w:r>
-        <w:rPr>
-          <w:lang w:val="fr-FR"/>
-        </w:rPr>
-        <w:t>MoteurAudio</w:t>
-      </w:r>
-      <w:proofErr w:type="spellEnd"/>
-      <w:r>
-        <w:rPr>
-          <w:lang w:val="fr-FR"/>
-        </w:rPr>
-        <w:t>)</w:t>
-      </w:r>
-      <w:r>
-        <w:rPr>
-          <w:lang w:val="fr-FR"/>
-        </w:rPr>
-        <w:t>.</w:t>
-      </w:r>
-    </w:p>
-    <w:p>
-      <w:pPr>
-        <w:rPr>
-          <w:lang w:val="fr-FR"/>
-        </w:rPr>
-      </w:pPr>
-      <w:r>
-        <w:rPr>
-          <w:lang w:val="fr-FR"/>
-        </w:rPr>
-        <w:t xml:space="preserve">- </w:t>
-      </w:r>
-      <w:r>
-        <w:rPr>
-          <w:lang w:val="fr-FR"/>
-        </w:rPr>
-        <w:t>Architecture Callback : J'ai abandonné la lecture bloquante pour une architecture asynchrone basée sur une Callback. Le moteur audio n'attend plus d'ordre de lecture direct mais alimente un flux continu (Stream) géré par la carte son.</w:t>
-      </w:r>
-    </w:p>
-    <w:p>
-      <w:pPr>
-        <w:rPr>
-          <w:lang w:val="fr-FR"/>
-        </w:rPr>
-      </w:pPr>
-      <w:r>
-        <w:rPr>
-          <w:lang w:val="fr-FR"/>
-        </w:rPr>
-        <w:t xml:space="preserve">- </w:t>
-      </w:r>
-      <w:r>
-        <w:rPr>
-          <w:lang w:val="fr-FR"/>
-        </w:rPr>
-        <w:t>Mixage Mathématique (</w:t>
-      </w:r>
-      <w:proofErr w:type="spellStart"/>
-      <w:r>
-        <w:rPr>
-          <w:lang w:val="fr-FR"/>
-        </w:rPr>
-        <w:t>NumPy</w:t>
-      </w:r>
-      <w:proofErr w:type="spellEnd"/>
-      <w:r>
-        <w:rPr>
-          <w:lang w:val="fr-FR"/>
-        </w:rPr>
-        <w:t xml:space="preserve">) : Conformément aux prévisions, j'ai intégré la bibliothèque scientifique </w:t>
-      </w:r>
-      <w:proofErr w:type="spellStart"/>
-      <w:r>
-        <w:rPr>
-          <w:lang w:val="fr-FR"/>
-        </w:rPr>
-        <w:t>NumPy</w:t>
-      </w:r>
-      <w:proofErr w:type="spellEnd"/>
-      <w:r>
-        <w:rPr>
-          <w:lang w:val="fr-FR"/>
-        </w:rPr>
-        <w:t xml:space="preserve">. Elle permet d'effectuer une addition mathématique des signaux audio en temps réel. Concrètement, si un Kick et un </w:t>
-      </w:r>
-      <w:proofErr w:type="spellStart"/>
-      <w:r>
-        <w:rPr>
-          <w:lang w:val="fr-FR"/>
-        </w:rPr>
-        <w:t>Snare</w:t>
-      </w:r>
-      <w:proofErr w:type="spellEnd"/>
-      <w:r>
-        <w:rPr>
-          <w:lang w:val="fr-FR"/>
-        </w:rPr>
-        <w:t xml:space="preserve"> tombent sur le même temps, leurs valeurs d'ondes sont additionnées numériquement avant d'être envoyées au flux de sortie</w:t>
-      </w:r>
-    </w:p>
-    <w:p>
-      <w:pPr>
-        <w:rPr>
-          <w:lang w:val="fr-FR"/>
-        </w:rPr>
-      </w:pPr>
-      <w:r>
-        <w:rPr>
-          <w:lang w:val="fr-FR"/>
-        </w:rPr>
-        <w:t xml:space="preserve">- </w:t>
-      </w:r>
-      <w:r>
-        <w:rPr>
-          <w:lang w:val="fr-FR"/>
-        </w:rPr>
-        <w:t>Résultat : Cette approche garantit désormais une polyphonie illimitée et une stabilité parfaite, même à des tempos très élevés (200 BPM), sans aucune coupure sonore.</w:t>
-      </w:r>
+        <w:t>Système de charge / sauvegarde</w:t>
+      </w:r>
+    </w:p>
+    <w:p>
+      <w:pPr>
+        <w:rPr>
+          <w:lang w:val="fr-FR"/>
+        </w:rPr>
+      </w:pPr>
+      <w:r>
+        <w:rPr>
+          <w:lang w:val="fr-FR"/>
+        </w:rPr>
+        <w:t xml:space="preserve">Pour répondre à cette exigence technique, j'ai fait le choix d'utiliser le format JSON, facilement manipulable en Python avec la bibliothèque standard json. Au niveau de la logique métier , j'ai enrichi la classe SequenceurCore de mon architecture avec deux nouvelles méthodes de sérialisation et désérialisation (exporter_donnees et importer_donnees). Lors d'une sauvegarde, le programme extrait l'état complet du séquenceur sous forme de dictionnaire : le tempo actuel (BPM), le volume global, ainsi que l'état précis de la grille de 16 pas et du mode "Mute" pour chaque piste. </w:t>
+      </w:r>
+    </w:p>
+    <w:p>
+      <w:pPr>
+        <w:rPr>
+          <w:rFonts w:asciiTheme="majorHAnsi" w:eastAsiaTheme="majorEastAsia" w:hAnsiTheme="majorHAnsi" w:cstheme="majorBidi"/>
+          <w:color w:val="0F4761" w:themeColor="accent1" w:themeShade="BF"/>
+          <w:sz w:val="32"/>
+          <w:szCs w:val="32"/>
+          <w:lang w:val="fr-FR"/>
+        </w:rPr>
+      </w:pPr>
+      <w:r>
+        <w:rPr>
+          <w:rFonts w:asciiTheme="majorHAnsi" w:eastAsiaTheme="majorEastAsia" w:hAnsiTheme="majorHAnsi" w:cstheme="majorBidi"/>
+          <w:color w:val="0F4761" w:themeColor="accent1" w:themeShade="BF"/>
+          <w:sz w:val="32"/>
+          <w:szCs w:val="32"/>
+          <w:lang w:val="fr-FR"/>
+        </w:rPr>
+        <w:t xml:space="preserve">Évolution de l'interface graphique et </w:t>
+      </w:r>
+      <w:r>
+        <w:rPr>
+          <w:rFonts w:asciiTheme="majorHAnsi" w:eastAsiaTheme="majorEastAsia" w:hAnsiTheme="majorHAnsi" w:cstheme="majorBidi"/>
+          <w:color w:val="0F4761" w:themeColor="accent1" w:themeShade="BF"/>
+          <w:sz w:val="32"/>
+          <w:szCs w:val="32"/>
+          <w:lang w:val="fr-FR"/>
+        </w:rPr>
+        <w:t>synchronization</w:t>
+      </w:r>
+    </w:p>
+    <w:p>
+      <w:pPr>
+        <w:rPr>
+          <w:lang w:val="fr-FR"/>
+        </w:rPr>
+      </w:pPr>
+      <w:r>
+        <w:rPr>
+          <w:lang w:val="fr-FR"/>
+        </w:rPr>
+        <w:t xml:space="preserve">Sur le plan de l'interface graphique </w:t>
+      </w:r>
+      <w:r>
+        <w:rPr>
+          <w:lang w:val="fr-FR"/>
+        </w:rPr>
+        <w:t>,</w:t>
+      </w:r>
+      <w:r>
+        <w:rPr>
+          <w:lang w:val="fr-FR"/>
+        </w:rPr>
+        <w:t>j'ai intégré une barre de contrôles dédiée à la gestion des fichiers en haut de la fenêtre principale. L'utilisation de la classe QFileDialog issue de la bibliothèque PySide6 a permis de déclencher l'ouverture de boîtes de dialogue natives offrant une expérience utilisateur familière et fluide.</w:t>
+      </w:r>
+    </w:p>
+    <w:p>
+      <w:pPr>
+        <w:rPr>
+          <w:lang w:val="fr-FR"/>
+        </w:rPr>
+      </w:pPr>
+      <w:r>
+        <w:rPr>
+          <w:lang w:val="fr-FR"/>
+        </w:rPr>
+        <w:t>Le défi technique principal de ce mois a résidé dans la synchronisation visuelle lors du chargement d'un projet existant. Il a fallu développer une logique permettant de mettre à jour dynamiquement tous les composants visuels de l'interface de manière programmatique :</w:t>
+      </w:r>
+    </w:p>
+    <w:p>
+      <w:pPr>
+        <w:rPr>
+          <w:lang w:val="fr-FR"/>
+        </w:rPr>
+      </w:pPr>
+      <w:r>
+        <w:rPr>
+          <w:lang w:val="fr-FR"/>
+        </w:rPr>
+        <w:t>Ajustement automatique de la position des sliders de Tempo et de Volume en fonction des données chargées.</w:t>
+      </w:r>
+    </w:p>
+    <w:p>
+      <w:pPr>
+        <w:rPr>
+          <w:lang w:val="fr-FR"/>
+        </w:rPr>
+      </w:pPr>
+      <w:r>
+        <w:rPr>
+          <w:lang w:val="fr-FR"/>
+        </w:rPr>
+        <w:t>Mise à jour visuelle des cases à cocher de la matrice de 16 pas pour chaque instrument, afin de refléter fidèlement le rythme sauvegardé.</w:t>
+      </w:r>
+    </w:p>
+    <w:p>
+      <w:pPr>
+        <w:rPr>
+          <w:lang w:val="fr-FR"/>
+        </w:rPr>
+      </w:pPr>
+      <w:r>
+        <w:rPr>
+          <w:lang w:val="fr-FR"/>
+        </w:rPr>
+        <w:t>Application immédiate des paramètres temporels au QTimer sans perturber le moteur audio en cours de route.</w:t>
+      </w:r>
+    </w:p>
+    <w:p>
+      <w:pPr>
+        <w:rPr>
+          <w:lang w:val="fr-FR"/>
+        </w:rPr>
+      </w:pPr>
     </w:p>
     <w:p>
       <w:pPr>
@@ -199,190 +195,6 @@
         <w:rPr>
           <w:lang w:val="fr-FR"/>
         </w:rPr>
-        <w:t>Évolution de l'Interface et Expérience Utilisateur</w:t>
-      </w:r>
-    </w:p>
-    <w:p>
-      <w:pPr>
-        <w:rPr>
-          <w:lang w:val="fr-FR"/>
-        </w:rPr>
-      </w:pPr>
-      <w:r>
-        <w:rPr>
-          <w:lang w:val="fr-FR"/>
-        </w:rPr>
-        <w:t>L'interface graphique a évolué pour transformer le prototype en un instrument jouable et réactif :</w:t>
-      </w:r>
-    </w:p>
-    <w:p>
-      <w:pPr>
-        <w:rPr>
-          <w:lang w:val="fr-FR"/>
-        </w:rPr>
-      </w:pPr>
-      <w:r>
-        <w:rPr>
-          <w:lang w:val="fr-FR"/>
-        </w:rPr>
-        <w:t xml:space="preserve">- </w:t>
-      </w:r>
-      <w:r>
-        <w:rPr>
-          <w:lang w:val="fr-FR"/>
-        </w:rPr>
-        <w:t xml:space="preserve">Feedback </w:t>
-      </w:r>
-      <w:proofErr w:type="gramStart"/>
-      <w:r>
-        <w:rPr>
-          <w:lang w:val="fr-FR"/>
-        </w:rPr>
-        <w:t>Visuel:</w:t>
-      </w:r>
-      <w:proofErr w:type="gramEnd"/>
-      <w:r>
-        <w:rPr>
-          <w:lang w:val="fr-FR"/>
-        </w:rPr>
-        <w:t xml:space="preserve"> J'ai implémenté un système de suivi visuel qui illumine la colonne active de la grille en temps réel. Cela permet à l'utilisateur de savoir exactement quel temps est en train d'être joué, comblant le manque de repères visuels de la version de décembre.</w:t>
-      </w:r>
-    </w:p>
-    <w:p>
-      <w:pPr>
-        <w:rPr>
-          <w:lang w:val="fr-FR"/>
-        </w:rPr>
-      </w:pPr>
-      <w:r>
-        <w:rPr>
-          <w:lang w:val="fr-FR"/>
-        </w:rPr>
-        <w:t xml:space="preserve">- </w:t>
-      </w:r>
-      <w:r>
-        <w:rPr>
-          <w:lang w:val="fr-FR"/>
-        </w:rPr>
-        <w:t xml:space="preserve">Contrôle du Tempo : L'intervalle de lecture n'est plus fixe. J'ai ajouté un contrôleur dynamique (Slider) permettant de faire varier le tempo de 60 à 200 BPM. Une formule mathématique ($Intervalle = 60000 / BPM / 4$) recalcule instantanément la vitesse du </w:t>
-      </w:r>
-      <w:proofErr w:type="spellStart"/>
-      <w:r>
-        <w:rPr>
-          <w:lang w:val="fr-FR"/>
-        </w:rPr>
-        <w:t>QTimer</w:t>
-      </w:r>
-      <w:proofErr w:type="spellEnd"/>
-      <w:r>
-        <w:rPr>
-          <w:lang w:val="fr-FR"/>
-        </w:rPr>
-        <w:t xml:space="preserve"> sans interrompre la lecture.</w:t>
-      </w:r>
-    </w:p>
-    <w:p>
-      <w:pPr>
-        <w:rPr>
-          <w:lang w:val="fr-FR"/>
-        </w:rPr>
-      </w:pPr>
-    </w:p>
-    <w:p>
-      <w:pPr>
-        <w:pStyle w:val="Titre2"/>
-        <w:rPr>
-          <w:lang w:val="fr-FR"/>
-        </w:rPr>
-      </w:pPr>
-      <w:r>
-        <w:rPr>
-          <w:lang w:val="fr-FR"/>
-        </w:rPr>
-        <w:t xml:space="preserve">Qualité du Code et </w:t>
-      </w:r>
-      <w:proofErr w:type="spellStart"/>
-      <w:r>
-        <w:rPr>
-          <w:lang w:val="fr-FR"/>
-        </w:rPr>
-        <w:t>Refactoring</w:t>
-      </w:r>
-      <w:proofErr w:type="spellEnd"/>
-    </w:p>
-    <w:p>
-      <w:pPr>
-        <w:rPr>
-          <w:lang w:val="fr-FR"/>
-        </w:rPr>
-      </w:pPr>
-      <w:r>
-        <w:rPr>
-          <w:lang w:val="fr-FR"/>
-        </w:rPr>
-        <w:t>Profitant de la fin de cette phase de développement critique, j'ai effectué un nettoyage global du code (</w:t>
-      </w:r>
-      <w:proofErr w:type="spellStart"/>
-      <w:r>
-        <w:rPr>
-          <w:lang w:val="fr-FR"/>
-        </w:rPr>
-        <w:t>Refactoring</w:t>
-      </w:r>
-      <w:proofErr w:type="spellEnd"/>
-      <w:r>
-        <w:rPr>
-          <w:lang w:val="fr-FR"/>
-        </w:rPr>
-        <w:t xml:space="preserve">). Les commentaires superflus ont été remplacés par des </w:t>
-      </w:r>
-      <w:proofErr w:type="spellStart"/>
-      <w:r>
-        <w:rPr>
-          <w:lang w:val="fr-FR"/>
-        </w:rPr>
-        <w:t>docstrings</w:t>
-      </w:r>
-      <w:proofErr w:type="spellEnd"/>
-      <w:r>
-        <w:rPr>
-          <w:lang w:val="fr-FR"/>
-        </w:rPr>
-        <w:t xml:space="preserve"> techniques standardisées, et la gestion des dépendances a été mise à jour (ajout de </w:t>
-      </w:r>
-      <w:proofErr w:type="spellStart"/>
-      <w:r>
-        <w:rPr>
-          <w:lang w:val="fr-FR"/>
-        </w:rPr>
-        <w:t>numpy</w:t>
-      </w:r>
-      <w:proofErr w:type="spellEnd"/>
-      <w:r>
-        <w:rPr>
-          <w:lang w:val="fr-FR"/>
-        </w:rPr>
-        <w:t xml:space="preserve"> dans requirements.txt) pour garantir la portabilité du projet.</w:t>
-      </w:r>
-    </w:p>
-    <w:p>
-      <w:pPr>
-        <w:rPr>
-          <w:lang w:val="fr-FR"/>
-        </w:rPr>
-      </w:pPr>
-    </w:p>
-    <w:p>
-      <w:pPr>
-        <w:pStyle w:val="Titre2"/>
-        <w:rPr>
-          <w:lang w:val="fr-FR"/>
-        </w:rPr>
-      </w:pPr>
-      <w:r>
-        <w:rPr>
-          <w:lang w:val="fr-FR"/>
-        </w:rPr>
         <w:t>Conclusion</w:t>
       </w:r>
     </w:p>
@@ -396,20 +208,20 @@
         <w:rPr>
           <w:lang w:val="fr-FR"/>
         </w:rPr>
-        <w:t>Les objectifs de janvier sont pleinement atteints. Le logiciel a franchi un cap technique décisif : il n'est plus un simple lanceur de sons séquentiel, mais un véritable moteur de mixage temps réel stable.</w:t>
-      </w:r>
-    </w:p>
-    <w:p>
-      <w:pPr>
-        <w:rPr>
-          <w:lang w:val="fr-FR"/>
-        </w:rPr>
-      </w:pPr>
-      <w:r>
-        <w:rPr>
-          <w:lang w:val="fr-FR"/>
-        </w:rPr>
-        <w:t>Avec un moteur audio robuste et une interface fonctionnelle, le projet est prêt pour la prochaine étape prévue au cahier des charges : la persistance des données. Le mois de février sera donc consacré à l'implémentation de la sauvegarde et du chargement des projets (format JSON), afin de permettre à l'utilisateur de conserver ses compositions.</w:t>
+        <w:t>Les objectifs fixés pour le mois de février sont pleinement validés. Le logiciel dispose désormais d'un système de sauvegarde et de chargement robuste, permettant aux utilisateurs de ne plus perdre leur travail à la fermeture de l'application. Des tests de robustesse ont été effectués (chargement de rythmes très rapides à 180 BPM en cours de lecture) et le moteur développé en janvier supporte parfaitement ces transitions dynamiques.</w:t>
+      </w:r>
+    </w:p>
+    <w:p>
+      <w:pPr>
+        <w:rPr>
+          <w:lang w:val="fr-FR"/>
+        </w:rPr>
+      </w:pPr>
+      <w:r>
+        <w:rPr>
+          <w:lang w:val="fr-FR"/>
+        </w:rPr>
+        <w:t>Le mois de mars sera dédié à l'implémentation de fonctionnalités avancées qui enrichiront l'expérience musicale. Il est notamment prévu d'ajouter un explorateur de fichiers permettant à l'utilisateur de charger et d'importer ses propres samples audio (.wav) pour s'affranchir des sons par défaut, et de commencer à étudier l'exportation du mixage final en fichier audio.</w:t>
       </w:r>
     </w:p>
     <w:p>
@@ -496,9 +308,9 @@
 <file path=word/numbering.xml><?xml version="1.0" encoding="utf-8"?>
 <w:numbering xmlns:wpc="http://schemas.microsoft.com/office/word/2010/wordprocessingCanvas" xmlns:cx="http://schemas.microsoft.com/office/drawing/2014/chartex" xmlns:cx1="http://schemas.microsoft.com/office/drawing/2015/9/8/chartex" xmlns:cx2="http://schemas.microsoft.com/office/drawing/2015/10/21/chartex" xmlns:cx3="http://schemas.microsoft.com/office/drawing/2016/5/9/chartex" xmlns:cx4="http://schemas.microsoft.com/office/drawing/2016/5/10/chartex" xmlns:cx5="http://schemas.microsoft.com/office/drawing/2016/5/11/chartex" xmlns:cx6="http://schemas.microsoft.com/office/drawing/2016/5/12/chartex" xmlns:cx7="http://schemas.microsoft.com/office/drawing/2016/5/13/chartex" xmlns:cx8="http://schemas.microsoft.com/office/drawing/2016/5/14/chartex" xmlns:mc="http://schemas.openxmlformats.org/markup-compatibility/2006" xmlns:aink="http://schemas.microsoft.com/office/drawing/2016/ink" xmlns:am3d="http://schemas.microsoft.com/office/drawing/2017/model3d" xmlns:o="urn:schemas-microsoft-com:office:office" xmlns:oel="http://schemas.microsoft.com/office/2019/extlst" xmlns:r="http://schemas.openxmlformats.org/officeDocument/2006/relationships" xmlns:m="http://schemas.openxmlformats.org/officeDocument/2006/math" xmlns:v="urn:schemas-microsoft-com:vml" xmlns:wp14="http://schemas.microsoft.com/office/word/2010/wordprocessingDrawing" xmlns:wp="http://schemas.openxmlformats.org/drawingml/2006/wordprocessingDrawing" xmlns:w10="urn:schemas-microsoft-com:office:word" xmlns:w="http://schemas.openxmlformats.org/wordprocessingml/2006/main" xmlns:w14="http://schemas.microsoft.com/office/word/2010/wordml" xmlns:w15="http://schemas.microsoft.com/office/word/2012/wordml" xmlns:w16cex="http://schemas.microsoft.com/office/word/2018/wordml/cex" xmlns:w16cid="http://schemas.microsoft.com/office/word/2016/wordml/cid" xmlns:w16="http://schemas.microsoft.com/office/word/2018/wordml" xmlns:w16du="http://schemas.microsoft.com/office/word/2023/wordml/word16du" xmlns:w16sdtdh="http://schemas.microsoft.com/office/word/2020/wordml/sdtdatahash" xmlns:w16sdtfl="http://schemas.microsoft.com/office/word/2024/wordml/sdtformatlock" xmlns:w16se="http://schemas.microsoft.com/office/word/2015/wordml/symex" xmlns:wpg="http://schemas.microsoft.com/office/word/2010/wordprocessingGroup" xmlns:wpi="http://schemas.microsoft.com/office/word/2010/wordprocessingInk" xmlns:wne="http://schemas.microsoft.com/office/word/2006/wordml" xmlns:wps="http://schemas.microsoft.com/office/word/2010/wordprocessingShape" mc:Ignorable="w14 w15 w16se w16cid w16 w16cex w16sdtdh w16sdtfl w16du wp14">
   <w:abstractNum w:abstractNumId="0" w15:restartNumberingAfterBreak="0">
-    <w:nsid w:val="52C0453B"/>
+    <w:nsid w:val="03FE57F1"/>
     <w:multiLevelType w:val="multilevel"/>
-    <w:tmpl w:val="3F24D59E"/>
+    <w:tmpl w:val="DE1C623E"/>
     <w:lvl w:ilvl="0">
       <w:start w:val="1"/>
       <w:numFmt w:val="bullet"/>
@@ -644,7 +456,159 @@
       </w:rPr>
     </w:lvl>
   </w:abstractNum>
+  <w:abstractNum w:abstractNumId="1" w15:restartNumberingAfterBreak="0">
+    <w:nsid w:val="52C0453B"/>
+    <w:multiLevelType w:val="multilevel"/>
+    <w:tmpl w:val="3F24D59E"/>
+    <w:lvl w:ilvl="0">
+      <w:start w:val="1"/>
+      <w:numFmt w:val="bullet"/>
+      <w:lvlText w:val=""/>
+      <w:lvlJc w:val="left"/>
+      <w:pPr>
+        <w:tabs>
+          <w:tab w:val="num" w:pos="720"/>
+        </w:tabs>
+        <w:ind w:left="720" w:hanging="360"/>
+      </w:pPr>
+      <w:rPr>
+        <w:rFonts w:ascii="Symbol" w:hAnsi="Symbol" w:hint="default"/>
+        <w:sz w:val="20"/>
+      </w:rPr>
+    </w:lvl>
+    <w:lvl w:ilvl="1" w:tentative="1">
+      <w:start w:val="1"/>
+      <w:numFmt w:val="bullet"/>
+      <w:lvlText w:val="o"/>
+      <w:lvlJc w:val="left"/>
+      <w:pPr>
+        <w:tabs>
+          <w:tab w:val="num" w:pos="1440"/>
+        </w:tabs>
+        <w:ind w:left="1440" w:hanging="360"/>
+      </w:pPr>
+      <w:rPr>
+        <w:rFonts w:ascii="Courier New" w:hAnsi="Courier New" w:hint="default"/>
+        <w:sz w:val="20"/>
+      </w:rPr>
+    </w:lvl>
+    <w:lvl w:ilvl="2" w:tentative="1">
+      <w:start w:val="1"/>
+      <w:numFmt w:val="bullet"/>
+      <w:lvlText w:val=""/>
+      <w:lvlJc w:val="left"/>
+      <w:pPr>
+        <w:tabs>
+          <w:tab w:val="num" w:pos="2160"/>
+        </w:tabs>
+        <w:ind w:left="2160" w:hanging="360"/>
+      </w:pPr>
+      <w:rPr>
+        <w:rFonts w:ascii="Wingdings" w:hAnsi="Wingdings" w:hint="default"/>
+        <w:sz w:val="20"/>
+      </w:rPr>
+    </w:lvl>
+    <w:lvl w:ilvl="3" w:tentative="1">
+      <w:start w:val="1"/>
+      <w:numFmt w:val="bullet"/>
+      <w:lvlText w:val=""/>
+      <w:lvlJc w:val="left"/>
+      <w:pPr>
+        <w:tabs>
+          <w:tab w:val="num" w:pos="2880"/>
+        </w:tabs>
+        <w:ind w:left="2880" w:hanging="360"/>
+      </w:pPr>
+      <w:rPr>
+        <w:rFonts w:ascii="Wingdings" w:hAnsi="Wingdings" w:hint="default"/>
+        <w:sz w:val="20"/>
+      </w:rPr>
+    </w:lvl>
+    <w:lvl w:ilvl="4" w:tentative="1">
+      <w:start w:val="1"/>
+      <w:numFmt w:val="bullet"/>
+      <w:lvlText w:val=""/>
+      <w:lvlJc w:val="left"/>
+      <w:pPr>
+        <w:tabs>
+          <w:tab w:val="num" w:pos="3600"/>
+        </w:tabs>
+        <w:ind w:left="3600" w:hanging="360"/>
+      </w:pPr>
+      <w:rPr>
+        <w:rFonts w:ascii="Wingdings" w:hAnsi="Wingdings" w:hint="default"/>
+        <w:sz w:val="20"/>
+      </w:rPr>
+    </w:lvl>
+    <w:lvl w:ilvl="5" w:tentative="1">
+      <w:start w:val="1"/>
+      <w:numFmt w:val="bullet"/>
+      <w:lvlText w:val=""/>
+      <w:lvlJc w:val="left"/>
+      <w:pPr>
+        <w:tabs>
+          <w:tab w:val="num" w:pos="4320"/>
+        </w:tabs>
+        <w:ind w:left="4320" w:hanging="360"/>
+      </w:pPr>
+      <w:rPr>
+        <w:rFonts w:ascii="Wingdings" w:hAnsi="Wingdings" w:hint="default"/>
+        <w:sz w:val="20"/>
+      </w:rPr>
+    </w:lvl>
+    <w:lvl w:ilvl="6" w:tentative="1">
+      <w:start w:val="1"/>
+      <w:numFmt w:val="bullet"/>
+      <w:lvlText w:val=""/>
+      <w:lvlJc w:val="left"/>
+      <w:pPr>
+        <w:tabs>
+          <w:tab w:val="num" w:pos="5040"/>
+        </w:tabs>
+        <w:ind w:left="5040" w:hanging="360"/>
+      </w:pPr>
+      <w:rPr>
+        <w:rFonts w:ascii="Wingdings" w:hAnsi="Wingdings" w:hint="default"/>
+        <w:sz w:val="20"/>
+      </w:rPr>
+    </w:lvl>
+    <w:lvl w:ilvl="7" w:tentative="1">
+      <w:start w:val="1"/>
+      <w:numFmt w:val="bullet"/>
+      <w:lvlText w:val=""/>
+      <w:lvlJc w:val="left"/>
+      <w:pPr>
+        <w:tabs>
+          <w:tab w:val="num" w:pos="5760"/>
+        </w:tabs>
+        <w:ind w:left="5760" w:hanging="360"/>
+      </w:pPr>
+      <w:rPr>
+        <w:rFonts w:ascii="Wingdings" w:hAnsi="Wingdings" w:hint="default"/>
+        <w:sz w:val="20"/>
+      </w:rPr>
+    </w:lvl>
+    <w:lvl w:ilvl="8" w:tentative="1">
+      <w:start w:val="1"/>
+      <w:numFmt w:val="bullet"/>
+      <w:lvlText w:val=""/>
+      <w:lvlJc w:val="left"/>
+      <w:pPr>
+        <w:tabs>
+          <w:tab w:val="num" w:pos="6480"/>
+        </w:tabs>
+        <w:ind w:left="6480" w:hanging="360"/>
+      </w:pPr>
+      <w:rPr>
+        <w:rFonts w:ascii="Wingdings" w:hAnsi="Wingdings" w:hint="default"/>
+        <w:sz w:val="20"/>
+      </w:rPr>
+    </w:lvl>
+  </w:abstractNum>
   <w:num w:numId="1" w16cid:durableId="1694065123">
+    <w:abstractNumId w:val="1"/>
+  </w:num>
+  <w:num w:numId="2" w16cid:durableId="821046755">
     <w:abstractNumId w:val="0"/>
   </w:num>
 </w:numbering>

</xml_diff>

<commit_message>
Ajout du rapport mensuel de mars
</commit_message>
<xml_diff>
--- a/ressources/Rapports Mensuels/Séquenceur Novembre.docx
+++ b/ressources/Rapports Mensuels/Séquenceur Novembre.docx
@@ -19,7 +19,7 @@
         <w:rPr>
           <w:lang w:val="fr-FR"/>
         </w:rPr>
-        <w:t>février</w:t>
+        <w:t>Mars</w:t>
       </w:r>
     </w:p>
     <w:p>
@@ -39,22 +39,78 @@
         <w:rPr>
           <w:lang w:val="fr-FR"/>
         </w:rPr>
-        <w:t>Conformément à la conclusion du rapport de janvier, l'étape suivante prévue au cahier des charges était la persistance des données. Le mois de février a donc été intégralement consacré à l'implémentation de la sauvegarde et du chargement des projets au format JSON, afin de permettre à l'utilisateur de conserver ses créations et compositions. Le moteur audio asynchrone et l'interface étant désormais stables, cette étape était cruciale pour transformer le prototype en un véritable logiciel utilitaire.</w:t>
+        <w:t>Informations</w:t>
       </w:r>
     </w:p>
     <w:p>
       <w:pPr>
-        <w:pStyle w:val="Titre2"/>
-        <w:rPr>
-          <w:lang w:val="fr-FR"/>
-        </w:rPr>
-      </w:pPr>
-      <w:r>
-        <w:rPr>
-          <w:lang w:val="fr-FR"/>
-        </w:rPr>
-        <w:t>Système de charge / sauvegarde</w:t>
-      </w:r>
+        <w:rPr>
+          <w:lang w:val="fr-FR"/>
+        </w:rPr>
+      </w:pPr>
+      <w:r>
+        <w:rPr>
+          <w:lang w:val="fr-FR"/>
+        </w:rPr>
+        <w:t xml:space="preserve">Mon travail pour ce mois disponible sur la branche </w:t>
+      </w:r>
+      <w:proofErr w:type="spellStart"/>
+      <w:r>
+        <w:rPr>
+          <w:lang w:val="fr-FR"/>
+        </w:rPr>
+        <w:t>feature</w:t>
+      </w:r>
+      <w:proofErr w:type="spellEnd"/>
+      <w:r>
+        <w:rPr>
+          <w:lang w:val="fr-FR"/>
+        </w:rPr>
+        <w:t xml:space="preserve">/mars de mon projet </w:t>
+      </w:r>
+      <w:proofErr w:type="spellStart"/>
+      <w:r>
+        <w:rPr>
+          <w:lang w:val="fr-FR"/>
+        </w:rPr>
+        <w:t>github</w:t>
+      </w:r>
+      <w:proofErr w:type="spellEnd"/>
+      <w:r>
+        <w:rPr>
+          <w:lang w:val="fr-FR"/>
+        </w:rPr>
+        <w:t xml:space="preserve"> : </w:t>
+      </w:r>
+      <w:hyperlink r:id="rId7" w:history="1">
+        <w:r>
+          <w:rPr>
+            <w:rStyle w:val="Lienhypertexte"/>
+            <w:i/>
+            <w:iCs/>
+            <w:lang w:val="fr-FR"/>
+          </w:rPr>
+          <w:t>https://github.com/ElChahine/Seq</w:t>
+        </w:r>
+        <w:r>
+          <w:rPr>
+            <w:rStyle w:val="Lienhypertexte"/>
+            <w:i/>
+            <w:iCs/>
+            <w:lang w:val="fr-FR"/>
+          </w:rPr>
+          <w:t>u</w:t>
+        </w:r>
+        <w:r>
+          <w:rPr>
+            <w:rStyle w:val="Lienhypertexte"/>
+            <w:i/>
+            <w:iCs/>
+            <w:lang w:val="fr-FR"/>
+          </w:rPr>
+          <w:t>enceur/tree/feature/mars</w:t>
+        </w:r>
+      </w:hyperlink>
     </w:p>
     <w:p>
       <w:pPr>
@@ -62,12 +118,167 @@
           <w:lang w:val="fr-FR"/>
         </w:rPr>
       </w:pPr>
-      <w:r>
-        <w:rPr>
-          <w:lang w:val="fr-FR"/>
-        </w:rPr>
-        <w:t xml:space="preserve">Pour répondre à cette exigence technique, j'ai fait le choix d'utiliser le format JSON, facilement manipulable en Python avec la bibliothèque standard json. Au niveau de la logique métier , j'ai enrichi la classe SequenceurCore de mon architecture avec deux nouvelles méthodes de sérialisation et désérialisation (exporter_donnees et importer_donnees). Lors d'une sauvegarde, le programme extrait l'état complet du séquenceur sous forme de dictionnaire : le tempo actuel (BPM), le volume global, ainsi que l'état précis de la grille de 16 pas et du mode "Mute" pour chaque piste. </w:t>
-      </w:r>
+    </w:p>
+    <w:p>
+      <w:pPr>
+        <w:rPr>
+          <w:lang w:val="fr-FR"/>
+        </w:rPr>
+      </w:pPr>
+    </w:p>
+    <w:p>
+      <w:pPr>
+        <w:rPr>
+          <w:lang w:val="fr-FR"/>
+        </w:rPr>
+      </w:pPr>
+      <w:r>
+        <w:rPr>
+          <w:lang w:val="fr-FR"/>
+        </w:rPr>
+        <w:t>Conformément aux perspectives annoncées dans le rapport de février, le mois de mars a été consacré à l'implémentation de fonctionnalités avancées visant à transformer le prototype en un outil de production musicale complet. L'accent a été mis sur l'ouverture du logiciel (importation/exportation) et sur le traitement du signal (effets audio), répondant ainsi aux objectifs secondaires définis dans le cahier des charges initia</w:t>
+      </w:r>
+      <w:r>
+        <w:rPr>
+          <w:lang w:val="fr-FR"/>
+        </w:rPr>
+        <w:t>l.</w:t>
+      </w:r>
+    </w:p>
+    <w:p>
+      <w:pPr>
+        <w:pStyle w:val="Titre2"/>
+        <w:rPr>
+          <w:lang w:val="fr-FR"/>
+        </w:rPr>
+      </w:pPr>
+      <w:r>
+        <w:rPr>
+          <w:lang w:val="fr-FR"/>
+        </w:rPr>
+        <w:t>Exportation audio</w:t>
+      </w:r>
+    </w:p>
+    <w:p>
+      <w:pPr>
+        <w:rPr>
+          <w:lang w:val="fr-FR"/>
+        </w:rPr>
+      </w:pPr>
+      <w:r>
+        <w:rPr>
+          <w:lang w:val="fr-FR"/>
+        </w:rPr>
+        <w:t>L'une des étapes les plus complexes de ce mois a été la création d'un moteur de rendu non-temps réel pour l'exportation :</w:t>
+      </w:r>
+    </w:p>
+    <w:p>
+      <w:pPr>
+        <w:rPr>
+          <w:lang w:val="fr-FR"/>
+        </w:rPr>
+      </w:pPr>
+      <w:r>
+        <w:rPr>
+          <w:lang w:val="fr-FR"/>
+        </w:rPr>
+        <w:t xml:space="preserve">- </w:t>
+      </w:r>
+      <w:r>
+        <w:rPr>
+          <w:lang w:val="fr-FR"/>
+        </w:rPr>
+        <w:t xml:space="preserve">Algorithme de sommation : En capitalisant sur l'intégration de la bibliothèque </w:t>
+      </w:r>
+      <w:proofErr w:type="spellStart"/>
+      <w:r>
+        <w:rPr>
+          <w:i/>
+          <w:iCs/>
+          <w:lang w:val="fr-FR"/>
+        </w:rPr>
+        <w:t>NumPy</w:t>
+      </w:r>
+      <w:proofErr w:type="spellEnd"/>
+      <w:r>
+        <w:rPr>
+          <w:lang w:val="fr-FR"/>
+        </w:rPr>
+        <w:t xml:space="preserve"> réalisée en </w:t>
+      </w:r>
+      <w:proofErr w:type="gramStart"/>
+      <w:r>
+        <w:rPr>
+          <w:lang w:val="fr-FR"/>
+        </w:rPr>
+        <w:t>janvier ,</w:t>
+      </w:r>
+      <w:proofErr w:type="gramEnd"/>
+      <w:r>
+        <w:rPr>
+          <w:lang w:val="fr-FR"/>
+        </w:rPr>
+        <w:t xml:space="preserve"> j'ai conçu une méthode de rendu "offline" qui additionne mathématiquement les signaux de toutes les pistes sur plusieurs boucles.</w:t>
+      </w:r>
+    </w:p>
+    <w:p>
+      <w:pPr>
+        <w:rPr>
+          <w:i/>
+          <w:iCs/>
+          <w:lang w:val="fr-FR"/>
+        </w:rPr>
+      </w:pPr>
+      <w:r>
+        <w:rPr>
+          <w:lang w:val="fr-FR"/>
+        </w:rPr>
+        <w:t>-</w:t>
+      </w:r>
+      <w:r>
+        <w:rPr>
+          <w:lang w:val="fr-FR"/>
+        </w:rPr>
+        <w:t xml:space="preserve"> </w:t>
+      </w:r>
+      <w:proofErr w:type="spellStart"/>
+      <w:r>
+        <w:rPr>
+          <w:lang w:val="fr-FR"/>
+        </w:rPr>
+        <w:t>criture</w:t>
+      </w:r>
+      <w:proofErr w:type="spellEnd"/>
+      <w:r>
+        <w:rPr>
+          <w:lang w:val="fr-FR"/>
+        </w:rPr>
+        <w:t xml:space="preserve"> physique : Conformément aux choix technologiques d'octobre, la bibliothèque </w:t>
+      </w:r>
+      <w:proofErr w:type="spellStart"/>
+      <w:r>
+        <w:rPr>
+          <w:lang w:val="fr-FR"/>
+        </w:rPr>
+        <w:t>soundfile</w:t>
+      </w:r>
+      <w:proofErr w:type="spellEnd"/>
+      <w:r>
+        <w:rPr>
+          <w:lang w:val="fr-FR"/>
+        </w:rPr>
+        <w:t xml:space="preserve"> est utilisée pour encoder ce mixage final dans un fichier .</w:t>
+      </w:r>
+      <w:proofErr w:type="spellStart"/>
+      <w:r>
+        <w:rPr>
+          <w:i/>
+          <w:iCs/>
+          <w:lang w:val="fr-FR"/>
+        </w:rPr>
+        <w:t>wav</w:t>
+      </w:r>
+      <w:proofErr w:type="spellEnd"/>
     </w:p>
     <w:p>
       <w:pPr>
@@ -87,8 +298,9 @@
           <w:szCs w:val="32"/>
           <w:lang w:val="fr-FR"/>
         </w:rPr>
-        <w:t xml:space="preserve">Évolution de l'interface graphique et </w:t>
-      </w:r>
+        <w:t xml:space="preserve">L’effet </w:t>
+      </w:r>
+      <w:proofErr w:type="spellStart"/>
       <w:r>
         <w:rPr>
           <w:rFonts w:asciiTheme="majorHAnsi" w:eastAsiaTheme="majorEastAsia" w:hAnsiTheme="majorHAnsi" w:cstheme="majorBidi"/>
@@ -97,8 +309,9 @@
           <w:szCs w:val="32"/>
           <w:lang w:val="fr-FR"/>
         </w:rPr>
-        <w:t>synchronization</w:t>
-      </w:r>
+        <w:t>delay</w:t>
+      </w:r>
+      <w:proofErr w:type="spellEnd"/>
     </w:p>
     <w:p>
       <w:pPr>
@@ -110,19 +323,7 @@
         <w:rPr>
           <w:lang w:val="fr-FR"/>
         </w:rPr>
-        <w:t xml:space="preserve">Sur le plan de l'interface graphique </w:t>
-      </w:r>
-      <w:r>
-        <w:rPr>
-          <w:lang w:val="fr-FR"/>
-        </w:rPr>
-        <w:t>,</w:t>
-      </w:r>
-      <w:r>
-        <w:rPr>
-          <w:lang w:val="fr-FR"/>
-        </w:rPr>
-        <w:t>j'ai intégré une barre de contrôles dédiée à la gestion des fichiers en haut de la fenêtre principale. L'utilisation de la classe QFileDialog issue de la bibliothèque PySide6 a permis de déclencher l'ouverture de boîtes de dialogue natives offrant une expérience utilisateur familière et fluide.</w:t>
+        <w:t>Pour répondre à l'objectif des fonctionnalités avancées, j'ai introduit un premier processeur d'effets :</w:t>
       </w:r>
     </w:p>
     <w:p>
@@ -135,7 +336,7 @@
         <w:rPr>
           <w:lang w:val="fr-FR"/>
         </w:rPr>
-        <w:t>Le défi technique principal de ce mois a résidé dans la synchronisation visuelle lors du chargement d'un projet existant. Il a fallu développer une logique permettant de mettre à jour dynamiquement tous les composants visuels de l'interface de manière programmatique :</w:t>
+        <w:t>- Traitement temporel : Le moteur audio a été modifié pour intégrer une ligne de retard (Delay). L'algorithme consiste à créer un buffer circulaire où une partie du signal de sortie est réinjectée (feedback) avec un décalage et une atténuation.</w:t>
       </w:r>
     </w:p>
     <w:p>
@@ -148,20 +349,50 @@
         <w:rPr>
           <w:lang w:val="fr-FR"/>
         </w:rPr>
-        <w:t>Ajustement automatique de la position des sliders de Tempo et de Volume en fonction des données chargées.</w:t>
+        <w:t xml:space="preserve">- Contrôle UI : Un nouveau </w:t>
+      </w:r>
+      <w:proofErr w:type="spellStart"/>
+      <w:r>
+        <w:rPr>
+          <w:lang w:val="fr-FR"/>
+        </w:rPr>
+        <w:t>slider</w:t>
+      </w:r>
+      <w:proofErr w:type="spellEnd"/>
+      <w:r>
+        <w:rPr>
+          <w:lang w:val="fr-FR"/>
+        </w:rPr>
+        <w:t xml:space="preserve"> a été ajouté à l'interface graphique pour permettre à l'utilisateur de doser l'intensité de l'écho en temps réel, sans interrompre la boucle de lecture gérée par le </w:t>
+      </w:r>
+      <w:proofErr w:type="spellStart"/>
+      <w:r>
+        <w:rPr>
+          <w:lang w:val="fr-FR"/>
+        </w:rPr>
+        <w:t>QTimer</w:t>
+      </w:r>
+      <w:proofErr w:type="spellEnd"/>
+      <w:r>
+        <w:rPr>
+          <w:lang w:val="fr-FR"/>
+        </w:rPr>
+        <w:t>.</w:t>
       </w:r>
     </w:p>
     <w:p>
       <w:pPr>
-        <w:rPr>
-          <w:lang w:val="fr-FR"/>
-        </w:rPr>
-      </w:pPr>
-      <w:r>
-        <w:rPr>
-          <w:lang w:val="fr-FR"/>
-        </w:rPr>
-        <w:t>Mise à jour visuelle des cases à cocher de la matrice de 16 pas pour chaque instrument, afin de refléter fidèlement le rythme sauvegardé.</w:t>
+        <w:pStyle w:val="Titre2"/>
+        <w:rPr>
+          <w:lang w:val="fr-FR"/>
+        </w:rPr>
+      </w:pPr>
+      <w:r>
+        <w:rPr>
+          <w:lang w:val="fr-FR"/>
+        </w:rPr>
+        <w:lastRenderedPageBreak/>
+        <w:t>Conclusion</w:t>
       </w:r>
     </w:p>
     <w:p>
@@ -174,65 +405,67 @@
         <w:rPr>
           <w:lang w:val="fr-FR"/>
         </w:rPr>
-        <w:t>Application immédiate des paramètres temporels au QTimer sans perturber le moteur audio en cours de route.</w:t>
-      </w:r>
-    </w:p>
-    <w:p>
-      <w:pPr>
-        <w:rPr>
-          <w:lang w:val="fr-FR"/>
-        </w:rPr>
-      </w:pPr>
-    </w:p>
-    <w:p>
-      <w:pPr>
-        <w:pStyle w:val="Titre2"/>
-        <w:rPr>
-          <w:lang w:val="fr-FR"/>
-        </w:rPr>
-      </w:pPr>
-      <w:r>
-        <w:rPr>
-          <w:lang w:val="fr-FR"/>
-        </w:rPr>
-        <w:t>Conclusion</w:t>
-      </w:r>
-    </w:p>
-    <w:p>
-      <w:pPr>
-        <w:rPr>
-          <w:lang w:val="fr-FR"/>
-        </w:rPr>
-      </w:pPr>
-      <w:r>
-        <w:rPr>
-          <w:lang w:val="fr-FR"/>
-        </w:rPr>
-        <w:t>Les objectifs fixés pour le mois de février sont pleinement validés. Le logiciel dispose désormais d'un système de sauvegarde et de chargement robuste, permettant aux utilisateurs de ne plus perdre leur travail à la fermeture de l'application. Des tests de robustesse ont été effectués (chargement de rythmes très rapides à 180 BPM en cours de lecture) et le moteur développé en janvier supporte parfaitement ces transitions dynamiques.</w:t>
-      </w:r>
-    </w:p>
-    <w:p>
-      <w:pPr>
-        <w:rPr>
-          <w:lang w:val="fr-FR"/>
-        </w:rPr>
-      </w:pPr>
-      <w:r>
-        <w:rPr>
-          <w:lang w:val="fr-FR"/>
-        </w:rPr>
-        <w:t>Le mois de mars sera dédié à l'implémentation de fonctionnalités avancées qui enrichiront l'expérience musicale. Il est notamment prévu d'ajouter un explorateur de fichiers permettant à l'utilisateur de charger et d'importer ses propres samples audio (.wav) pour s'affranchir des sons par défaut, et de commencer à étudier l'exportation du mixage final en fichier audio.</w:t>
-      </w:r>
-    </w:p>
-    <w:p>
-      <w:pPr>
-        <w:rPr>
-          <w:lang w:val="fr-FR"/>
-        </w:rPr>
-      </w:pPr>
+        <w:t xml:space="preserve">Le mois de mars marque la fin du développement des fonctionnalités majeures. Le logiciel remplit désormais toutes les conditions d'un séquenceur moderne : gestion de motifs </w:t>
+      </w:r>
+      <w:proofErr w:type="gramStart"/>
+      <w:r>
+        <w:rPr>
+          <w:lang w:val="fr-FR"/>
+        </w:rPr>
+        <w:t>rythmiques ,</w:t>
+      </w:r>
+      <w:proofErr w:type="gramEnd"/>
+      <w:r>
+        <w:rPr>
+          <w:lang w:val="fr-FR"/>
+        </w:rPr>
+        <w:t xml:space="preserve"> polyphonie illimitée via </w:t>
+      </w:r>
+      <w:proofErr w:type="spellStart"/>
+      <w:proofErr w:type="gramStart"/>
+      <w:r>
+        <w:rPr>
+          <w:lang w:val="fr-FR"/>
+        </w:rPr>
+        <w:t>NumPy</w:t>
+      </w:r>
+      <w:proofErr w:type="spellEnd"/>
+      <w:r>
+        <w:rPr>
+          <w:lang w:val="fr-FR"/>
+        </w:rPr>
+        <w:t xml:space="preserve"> ,</w:t>
+      </w:r>
+      <w:proofErr w:type="gramEnd"/>
+      <w:r>
+        <w:rPr>
+          <w:lang w:val="fr-FR"/>
+        </w:rPr>
+        <w:t xml:space="preserve"> persistance des données via JSON et désormais, exportation et effets. Le mois d'avril sera dédié à la stabilisation finale du code, </w:t>
+      </w:r>
+      <w:proofErr w:type="gramStart"/>
+      <w:r>
+        <w:rPr>
+          <w:lang w:val="fr-FR"/>
+        </w:rPr>
+        <w:t>l’ajout</w:t>
+      </w:r>
+      <w:proofErr w:type="gramEnd"/>
+      <w:r>
+        <w:rPr>
+          <w:lang w:val="fr-FR"/>
+        </w:rPr>
+        <w:t xml:space="preserve"> de toutes dernières fonctionnalités, </w:t>
+      </w:r>
+      <w:r>
+        <w:rPr>
+          <w:lang w:val="fr-FR"/>
+        </w:rPr>
+        <w:t>à la correction d'éventuels bugs et à la préparation de la documentation de livraison.</w:t>
+      </w:r>
     </w:p>
     <w:sectPr>
-      <w:headerReference w:type="default" r:id="rId7"/>
+      <w:headerReference w:type="default" r:id="rId8"/>
       <w:pgSz w:w="12240" w:h="15840"/>
       <w:pgMar w:top="1417" w:right="1417" w:bottom="1417" w:left="1417" w:header="708" w:footer="708" w:gutter="0"/>
       <w:cols w:space="708"/>
@@ -457,6 +690,155 @@
     </w:lvl>
   </w:abstractNum>
   <w:abstractNum w:abstractNumId="1" w15:restartNumberingAfterBreak="0">
+    <w:nsid w:val="08DF76EB"/>
+    <w:multiLevelType w:val="multilevel"/>
+    <w:tmpl w:val="B418B210"/>
+    <w:lvl w:ilvl="0">
+      <w:start w:val="1"/>
+      <w:numFmt w:val="bullet"/>
+      <w:lvlText w:val=""/>
+      <w:lvlJc w:val="left"/>
+      <w:pPr>
+        <w:tabs>
+          <w:tab w:val="num" w:pos="720"/>
+        </w:tabs>
+        <w:ind w:left="720" w:hanging="360"/>
+      </w:pPr>
+      <w:rPr>
+        <w:rFonts w:ascii="Symbol" w:hAnsi="Symbol" w:hint="default"/>
+        <w:sz w:val="20"/>
+      </w:rPr>
+    </w:lvl>
+    <w:lvl w:ilvl="1" w:tentative="1">
+      <w:start w:val="1"/>
+      <w:numFmt w:val="bullet"/>
+      <w:lvlText w:val="o"/>
+      <w:lvlJc w:val="left"/>
+      <w:pPr>
+        <w:tabs>
+          <w:tab w:val="num" w:pos="1440"/>
+        </w:tabs>
+        <w:ind w:left="1440" w:hanging="360"/>
+      </w:pPr>
+      <w:rPr>
+        <w:rFonts w:ascii="Courier New" w:hAnsi="Courier New" w:hint="default"/>
+        <w:sz w:val="20"/>
+      </w:rPr>
+    </w:lvl>
+    <w:lvl w:ilvl="2" w:tentative="1">
+      <w:start w:val="1"/>
+      <w:numFmt w:val="bullet"/>
+      <w:lvlText w:val=""/>
+      <w:lvlJc w:val="left"/>
+      <w:pPr>
+        <w:tabs>
+          <w:tab w:val="num" w:pos="2160"/>
+        </w:tabs>
+        <w:ind w:left="2160" w:hanging="360"/>
+      </w:pPr>
+      <w:rPr>
+        <w:rFonts w:ascii="Wingdings" w:hAnsi="Wingdings" w:hint="default"/>
+        <w:sz w:val="20"/>
+      </w:rPr>
+    </w:lvl>
+    <w:lvl w:ilvl="3" w:tentative="1">
+      <w:start w:val="1"/>
+      <w:numFmt w:val="bullet"/>
+      <w:lvlText w:val=""/>
+      <w:lvlJc w:val="left"/>
+      <w:pPr>
+        <w:tabs>
+          <w:tab w:val="num" w:pos="2880"/>
+        </w:tabs>
+        <w:ind w:left="2880" w:hanging="360"/>
+      </w:pPr>
+      <w:rPr>
+        <w:rFonts w:ascii="Wingdings" w:hAnsi="Wingdings" w:hint="default"/>
+        <w:sz w:val="20"/>
+      </w:rPr>
+    </w:lvl>
+    <w:lvl w:ilvl="4" w:tentative="1">
+      <w:start w:val="1"/>
+      <w:numFmt w:val="bullet"/>
+      <w:lvlText w:val=""/>
+      <w:lvlJc w:val="left"/>
+      <w:pPr>
+        <w:tabs>
+          <w:tab w:val="num" w:pos="3600"/>
+        </w:tabs>
+        <w:ind w:left="3600" w:hanging="360"/>
+      </w:pPr>
+      <w:rPr>
+        <w:rFonts w:ascii="Wingdings" w:hAnsi="Wingdings" w:hint="default"/>
+        <w:sz w:val="20"/>
+      </w:rPr>
+    </w:lvl>
+    <w:lvl w:ilvl="5" w:tentative="1">
+      <w:start w:val="1"/>
+      <w:numFmt w:val="bullet"/>
+      <w:lvlText w:val=""/>
+      <w:lvlJc w:val="left"/>
+      <w:pPr>
+        <w:tabs>
+          <w:tab w:val="num" w:pos="4320"/>
+        </w:tabs>
+        <w:ind w:left="4320" w:hanging="360"/>
+      </w:pPr>
+      <w:rPr>
+        <w:rFonts w:ascii="Wingdings" w:hAnsi="Wingdings" w:hint="default"/>
+        <w:sz w:val="20"/>
+      </w:rPr>
+    </w:lvl>
+    <w:lvl w:ilvl="6" w:tentative="1">
+      <w:start w:val="1"/>
+      <w:numFmt w:val="bullet"/>
+      <w:lvlText w:val=""/>
+      <w:lvlJc w:val="left"/>
+      <w:pPr>
+        <w:tabs>
+          <w:tab w:val="num" w:pos="5040"/>
+        </w:tabs>
+        <w:ind w:left="5040" w:hanging="360"/>
+      </w:pPr>
+      <w:rPr>
+        <w:rFonts w:ascii="Wingdings" w:hAnsi="Wingdings" w:hint="default"/>
+        <w:sz w:val="20"/>
+      </w:rPr>
+    </w:lvl>
+    <w:lvl w:ilvl="7" w:tentative="1">
+      <w:start w:val="1"/>
+      <w:numFmt w:val="bullet"/>
+      <w:lvlText w:val=""/>
+      <w:lvlJc w:val="left"/>
+      <w:pPr>
+        <w:tabs>
+          <w:tab w:val="num" w:pos="5760"/>
+        </w:tabs>
+        <w:ind w:left="5760" w:hanging="360"/>
+      </w:pPr>
+      <w:rPr>
+        <w:rFonts w:ascii="Wingdings" w:hAnsi="Wingdings" w:hint="default"/>
+        <w:sz w:val="20"/>
+      </w:rPr>
+    </w:lvl>
+    <w:lvl w:ilvl="8" w:tentative="1">
+      <w:start w:val="1"/>
+      <w:numFmt w:val="bullet"/>
+      <w:lvlText w:val=""/>
+      <w:lvlJc w:val="left"/>
+      <w:pPr>
+        <w:tabs>
+          <w:tab w:val="num" w:pos="6480"/>
+        </w:tabs>
+        <w:ind w:left="6480" w:hanging="360"/>
+      </w:pPr>
+      <w:rPr>
+        <w:rFonts w:ascii="Wingdings" w:hAnsi="Wingdings" w:hint="default"/>
+        <w:sz w:val="20"/>
+      </w:rPr>
+    </w:lvl>
+  </w:abstractNum>
+  <w:abstractNum w:abstractNumId="2" w15:restartNumberingAfterBreak="0">
     <w:nsid w:val="52C0453B"/>
     <w:multiLevelType w:val="multilevel"/>
     <w:tmpl w:val="3F24D59E"/>
@@ -606,10 +988,13 @@
     </w:lvl>
   </w:abstractNum>
   <w:num w:numId="1" w16cid:durableId="1694065123">
-    <w:abstractNumId w:val="1"/>
+    <w:abstractNumId w:val="2"/>
   </w:num>
   <w:num w:numId="2" w16cid:durableId="821046755">
     <w:abstractNumId w:val="0"/>
+  </w:num>
+  <w:num w:numId="3" w16cid:durableId="1178082555">
+    <w:abstractNumId w:val="1"/>
   </w:num>
 </w:numbering>
 </file>
@@ -1216,6 +1601,7 @@
   <w:style w:type="character" w:default="1" w:styleId="Policepardfaut">
     <w:name w:val="Default Paragraph Font"/>
     <w:uiPriority w:val="1"/>
+    <w:semiHidden/>
     <w:unhideWhenUsed/>
   </w:style>
   <w:style w:type="table" w:default="1" w:styleId="TableauNormal">
@@ -1571,6 +1957,41 @@
     <w:link w:val="Pieddepage"/>
     <w:uiPriority w:val="99"/>
     <w:rsid w:val="004C35D2"/>
+  </w:style>
+  <w:style w:type="character" w:styleId="Lienhypertexte">
+    <w:name w:val="Hyperlink"/>
+    <w:basedOn w:val="Policepardfaut"/>
+    <w:uiPriority w:val="99"/>
+    <w:unhideWhenUsed/>
+    <w:rsid w:val="0086756B"/>
+    <w:rPr>
+      <w:color w:val="467886" w:themeColor="hyperlink"/>
+      <w:u w:val="single"/>
+    </w:rPr>
+  </w:style>
+  <w:style w:type="character" w:styleId="Mentionnonrsolue">
+    <w:name w:val="Unresolved Mention"/>
+    <w:basedOn w:val="Policepardfaut"/>
+    <w:uiPriority w:val="99"/>
+    <w:semiHidden/>
+    <w:unhideWhenUsed/>
+    <w:rsid w:val="0086756B"/>
+    <w:rPr>
+      <w:color w:val="605E5C"/>
+      <w:shd w:val="clear" w:color="auto" w:fill="E1DFDD"/>
+    </w:rPr>
+  </w:style>
+  <w:style w:type="character" w:styleId="Lienhypertextesuivivisit">
+    <w:name w:val="FollowedHyperlink"/>
+    <w:basedOn w:val="Policepardfaut"/>
+    <w:uiPriority w:val="99"/>
+    <w:semiHidden/>
+    <w:unhideWhenUsed/>
+    <w:rsid w:val="0086756B"/>
+    <w:rPr>
+      <w:color w:val="96607D" w:themeColor="followedHyperlink"/>
+      <w:u w:val="single"/>
+    </w:rPr>
   </w:style>
 </w:styles>
 </file>

</xml_diff>

<commit_message>
feat: application du thème sombre, raccourci barre espace pour lancer ou arreter la lecture, et possibilité de se déplacer sur la piste et de choisir l'endroit à partir duquel on veut spécifiquement entendre (précedemment, ca tournait juste en boucle du début à la fin sans possibilité d'y faire quoi que ce soit
</commit_message>
<xml_diff>
--- a/ressources/Rapports Mensuels/Séquenceur Novembre.docx
+++ b/ressources/Rapports Mensuels/Séquenceur Novembre.docx
@@ -19,7 +19,7 @@
         <w:rPr>
           <w:lang w:val="fr-FR"/>
         </w:rPr>
-        <w:t>Mars</w:t>
+        <w:t>Avril</w:t>
       </w:r>
     </w:p>
     <w:p>
@@ -45,6 +45,8 @@
     <w:p>
       <w:pPr>
         <w:rPr>
+          <w:i/>
+          <w:iCs/>
           <w:lang w:val="fr-FR"/>
         </w:rPr>
       </w:pPr>
@@ -54,33 +56,17 @@
         </w:rPr>
         <w:t xml:space="preserve">Mon travail pour ce mois disponible sur la branche </w:t>
       </w:r>
-      <w:proofErr w:type="spellStart"/>
-      <w:r>
-        <w:rPr>
-          <w:lang w:val="fr-FR"/>
-        </w:rPr>
-        <w:t>feature</w:t>
-      </w:r>
-      <w:proofErr w:type="spellEnd"/>
-      <w:r>
-        <w:rPr>
-          <w:lang w:val="fr-FR"/>
-        </w:rPr>
-        <w:t xml:space="preserve">/mars de mon projet </w:t>
-      </w:r>
-      <w:proofErr w:type="spellStart"/>
-      <w:r>
-        <w:rPr>
-          <w:lang w:val="fr-FR"/>
-        </w:rPr>
-        <w:t>github</w:t>
-      </w:r>
-      <w:proofErr w:type="spellEnd"/>
-      <w:r>
-        <w:rPr>
-          <w:lang w:val="fr-FR"/>
-        </w:rPr>
-        <w:t xml:space="preserve"> : </w:t>
+      <w:r>
+        <w:rPr>
+          <w:lang w:val="fr-FR"/>
+        </w:rPr>
+        <w:t>main</w:t>
+      </w:r>
+      <w:r>
+        <w:rPr>
+          <w:lang w:val="fr-FR"/>
+        </w:rPr>
+        <w:t xml:space="preserve"> de mon projet github : </w:t>
       </w:r>
       <w:hyperlink r:id="rId7" w:history="1">
         <w:r>
@@ -90,25 +76,7 @@
             <w:iCs/>
             <w:lang w:val="fr-FR"/>
           </w:rPr>
-          <w:t>https://github.com/ElChahine/Seq</w:t>
-        </w:r>
-        <w:r>
-          <w:rPr>
-            <w:rStyle w:val="Lienhypertexte"/>
-            <w:i/>
-            <w:iCs/>
-            <w:lang w:val="fr-FR"/>
-          </w:rPr>
-          <w:t>u</w:t>
-        </w:r>
-        <w:r>
-          <w:rPr>
-            <w:rStyle w:val="Lienhypertexte"/>
-            <w:i/>
-            <w:iCs/>
-            <w:lang w:val="fr-FR"/>
-          </w:rPr>
-          <w:t>enceur/tree/feature/mars</w:t>
+          <w:t>https://github.com/ElChahine/Sequenceur</w:t>
         </w:r>
       </w:hyperlink>
     </w:p>
@@ -121,55 +89,51 @@
     </w:p>
     <w:p>
       <w:pPr>
-        <w:rPr>
-          <w:lang w:val="fr-FR"/>
-        </w:rPr>
-      </w:pPr>
-    </w:p>
-    <w:p>
-      <w:pPr>
-        <w:rPr>
-          <w:lang w:val="fr-FR"/>
-        </w:rPr>
-      </w:pPr>
-      <w:r>
-        <w:rPr>
-          <w:lang w:val="fr-FR"/>
-        </w:rPr>
-        <w:t>Conformément aux perspectives annoncées dans le rapport de février, le mois de mars a été consacré à l'implémentation de fonctionnalités avancées visant à transformer le prototype en un outil de production musicale complet. L'accent a été mis sur l'ouverture du logiciel (importation/exportation) et sur le traitement du signal (effets audio), répondant ainsi aux objectifs secondaires définis dans le cahier des charges initia</w:t>
-      </w:r>
-      <w:r>
-        <w:rPr>
-          <w:lang w:val="fr-FR"/>
-        </w:rPr>
-        <w:t>l.</w:t>
-      </w:r>
-    </w:p>
-    <w:p>
-      <w:pPr>
         <w:pStyle w:val="Titre2"/>
         <w:rPr>
-          <w:lang w:val="fr-FR"/>
-        </w:rPr>
-      </w:pPr>
-      <w:r>
-        <w:rPr>
-          <w:lang w:val="fr-FR"/>
-        </w:rPr>
-        <w:t>Exportation audio</w:t>
-      </w:r>
-    </w:p>
-    <w:p>
-      <w:pPr>
-        <w:rPr>
-          <w:lang w:val="fr-FR"/>
-        </w:rPr>
-      </w:pPr>
-      <w:r>
-        <w:rPr>
-          <w:lang w:val="fr-FR"/>
-        </w:rPr>
-        <w:t>L'une des étapes les plus complexes de ce mois a été la création d'un moteur de rendu non-temps réel pour l'exportation :</w:t>
+          <w:rFonts w:asciiTheme="minorHAnsi" w:eastAsiaTheme="minorHAnsi" w:hAnsiTheme="minorHAnsi" w:cstheme="minorBidi"/>
+          <w:color w:val="auto"/>
+          <w:sz w:val="24"/>
+          <w:szCs w:val="24"/>
+          <w:lang w:val="fr-FR"/>
+        </w:rPr>
+      </w:pPr>
+      <w:r>
+        <w:rPr>
+          <w:rFonts w:asciiTheme="minorHAnsi" w:eastAsiaTheme="minorHAnsi" w:hAnsiTheme="minorHAnsi" w:cstheme="minorBidi"/>
+          <w:color w:val="auto"/>
+          <w:sz w:val="24"/>
+          <w:szCs w:val="24"/>
+          <w:lang w:val="fr-FR"/>
+        </w:rPr>
+        <w:t>Conformément à la conclusion du rapport de mars, le mois d’avril a été dédié à la stabilisation finale du code, à l’optimisation de l’expérience utilisateur et à la préparation de la documentation technique pour la livraison. L'objectif principal était de transformer le prototype fonctionnel en un logiciel robuste, capable de gérer des compositions plus complexes tout en garantissant une portabilité totale sur différentes machines.</w:t>
+      </w:r>
+    </w:p>
+    <w:p>
+      <w:pPr>
+        <w:pStyle w:val="Titre2"/>
+        <w:rPr>
+          <w:lang w:val="fr-FR"/>
+        </w:rPr>
+      </w:pPr>
+      <w:r>
+        <w:rPr>
+          <w:lang w:val="fr-FR"/>
+        </w:rPr>
+        <w:t>Extension de la structure musicale</w:t>
+      </w:r>
+    </w:p>
+    <w:p>
+      <w:pPr>
+        <w:rPr>
+          <w:lang w:val="fr-FR"/>
+        </w:rPr>
+      </w:pPr>
+      <w:r>
+        <w:rPr>
+          <w:lang w:val="fr-FR"/>
+        </w:rPr>
+        <w:t>Pour dépasser la limitation des 16 pas héritée des standards classiques de décembre, j'ai porté la capacité du séquenceur à 64 pas (soit 4 mesures complètes).</w:t>
       </w:r>
     </w:p>
     <w:p>
@@ -188,44 +152,12 @@
         <w:rPr>
           <w:lang w:val="fr-FR"/>
         </w:rPr>
-        <w:t xml:space="preserve">Algorithme de sommation : En capitalisant sur l'intégration de la bibliothèque </w:t>
-      </w:r>
-      <w:proofErr w:type="spellStart"/>
-      <w:r>
-        <w:rPr>
-          <w:i/>
-          <w:iCs/>
-          <w:lang w:val="fr-FR"/>
-        </w:rPr>
-        <w:t>NumPy</w:t>
-      </w:r>
-      <w:proofErr w:type="spellEnd"/>
-      <w:r>
-        <w:rPr>
-          <w:lang w:val="fr-FR"/>
-        </w:rPr>
-        <w:t xml:space="preserve"> réalisée en </w:t>
-      </w:r>
-      <w:proofErr w:type="gramStart"/>
-      <w:r>
-        <w:rPr>
-          <w:lang w:val="fr-FR"/>
-        </w:rPr>
-        <w:t>janvier ,</w:t>
-      </w:r>
-      <w:proofErr w:type="gramEnd"/>
-      <w:r>
-        <w:rPr>
-          <w:lang w:val="fr-FR"/>
-        </w:rPr>
-        <w:t xml:space="preserve"> j'ai conçu une méthode de rendu "offline" qui additionne mathématiquement les signaux de toutes les pistes sur plusieurs boucles.</w:t>
-      </w:r>
-    </w:p>
-    <w:p>
-      <w:pPr>
-        <w:rPr>
-          <w:i/>
-          <w:iCs/>
+        <w:t>Défi d'interface : Pour éviter l'encombrement visuel, j'ai implémenté une zone de défilement (QScrollArea) issue de PySide6. Cela permet à l'utilisateur de naviguer horizontalement dans la grille rythmique sans augmenter la taille de la fenêtre principale.</w:t>
+      </w:r>
+    </w:p>
+    <w:p>
+      <w:pPr>
+        <w:rPr>
           <w:lang w:val="fr-FR"/>
         </w:rPr>
       </w:pPr>
@@ -241,44 +173,12 @@
         </w:rPr>
         <w:t xml:space="preserve"> </w:t>
       </w:r>
-      <w:proofErr w:type="spellStart"/>
-      <w:r>
-        <w:rPr>
-          <w:lang w:val="fr-FR"/>
-        </w:rPr>
-        <w:t>criture</w:t>
-      </w:r>
-      <w:proofErr w:type="spellEnd"/>
-      <w:r>
-        <w:rPr>
-          <w:lang w:val="fr-FR"/>
-        </w:rPr>
-        <w:t xml:space="preserve"> physique : Conformément aux choix technologiques d'octobre, la bibliothèque </w:t>
-      </w:r>
-      <w:proofErr w:type="spellStart"/>
-      <w:r>
-        <w:rPr>
-          <w:lang w:val="fr-FR"/>
-        </w:rPr>
-        <w:t>soundfile</w:t>
-      </w:r>
-      <w:proofErr w:type="spellEnd"/>
-      <w:r>
-        <w:rPr>
-          <w:lang w:val="fr-FR"/>
-        </w:rPr>
-        <w:t xml:space="preserve"> est utilisée pour encoder ce mixage final dans un fichier .</w:t>
-      </w:r>
-      <w:proofErr w:type="spellStart"/>
-      <w:r>
-        <w:rPr>
-          <w:i/>
-          <w:iCs/>
-          <w:lang w:val="fr-FR"/>
-        </w:rPr>
-        <w:t>wav</w:t>
-      </w:r>
-      <w:proofErr w:type="spellEnd"/>
+      <w:r>
+        <w:rPr>
+          <w:lang w:val="fr-FR"/>
+        </w:rPr>
+        <w:t>Mise à jour logique : Le cœur du séquenceur (SequenceurCore) et le système de rendu de mars ont été adaptés pour traiter dynamiquement ces données étendues.</w:t>
+      </w:r>
     </w:p>
     <w:p>
       <w:pPr>
@@ -298,10 +198,88 @@
           <w:szCs w:val="32"/>
           <w:lang w:val="fr-FR"/>
         </w:rPr>
-        <w:t xml:space="preserve">L’effet </w:t>
-      </w:r>
-      <w:proofErr w:type="spellStart"/>
-      <w:r>
+        <w:t>Traitement du signal et Portabilité</w:t>
+      </w:r>
+    </w:p>
+    <w:p>
+      <w:pPr>
+        <w:rPr>
+          <w:lang w:val="fr-FR"/>
+        </w:rPr>
+      </w:pPr>
+      <w:r>
+        <w:rPr>
+          <w:lang w:val="fr-FR"/>
+        </w:rPr>
+        <w:t>Le mois d'avril a permis d'ajouter une dernière fonctionnalité de traitement du signal (DSP) ainsi qu'une sécurisation des ressources</w:t>
+      </w:r>
+      <w:r>
+        <w:rPr>
+          <w:lang w:val="fr-FR"/>
+        </w:rPr>
+        <w:t xml:space="preserve"> </w:t>
+      </w:r>
+      <w:r>
+        <w:rPr>
+          <w:lang w:val="fr-FR"/>
+        </w:rPr>
+        <w:t>:</w:t>
+      </w:r>
+    </w:p>
+    <w:p>
+      <w:pPr>
+        <w:rPr>
+          <w:lang w:val="fr-FR"/>
+        </w:rPr>
+      </w:pPr>
+      <w:r>
+        <w:rPr>
+          <w:lang w:val="fr-FR"/>
+        </w:rPr>
+        <w:t xml:space="preserve">- </w:t>
+      </w:r>
+      <w:r>
+        <w:rPr>
+          <w:lang w:val="fr-FR"/>
+        </w:rPr>
+        <w:t xml:space="preserve">Filtre Passe-Bas (Low-Pass Filter) : En complément de l'effet Delay de </w:t>
+      </w:r>
+      <w:proofErr w:type="gramStart"/>
+      <w:r>
+        <w:rPr>
+          <w:lang w:val="fr-FR"/>
+        </w:rPr>
+        <w:t>mars ,</w:t>
+      </w:r>
+      <w:proofErr w:type="gramEnd"/>
+      <w:r>
+        <w:rPr>
+          <w:lang w:val="fr-FR"/>
+        </w:rPr>
+        <w:t xml:space="preserve"> j'ai intégré un filtre passe-bas via NumPy. Cet algorithme de lissage permet d'étouffer les fréquences aiguës du mixage final, offrant une dimension sonore plus profonde aux compositions.</w:t>
+      </w:r>
+    </w:p>
+    <w:p>
+      <w:pPr>
+        <w:rPr>
+          <w:lang w:val="fr-FR"/>
+        </w:rPr>
+      </w:pPr>
+      <w:r>
+        <w:rPr>
+          <w:lang w:val="fr-FR"/>
+        </w:rPr>
+        <w:t xml:space="preserve">- </w:t>
+      </w:r>
+      <w:r>
+        <w:rPr>
+          <w:lang w:val="fr-FR"/>
+        </w:rPr>
+        <w:t>Gestion des chemins relatifs : Afin d'éviter les erreurs de fichiers introuvables lors du partage du projet (problématique identifiée en octobre), j'ai automatisé la détection du dossier racine via une variable BASE_DIR. Les sons sont désormais chargés via des chemins relatifs, garantissant que le logiciel fonctionne instantanément sur n'importe quel ordinateur.</w:t>
+      </w:r>
+    </w:p>
+    <w:p>
+      <w:pPr>
         <w:rPr>
           <w:rFonts w:asciiTheme="majorHAnsi" w:eastAsiaTheme="majorEastAsia" w:hAnsiTheme="majorHAnsi" w:cstheme="majorBidi"/>
           <w:color w:val="0F4761" w:themeColor="accent1" w:themeShade="BF"/>
@@ -309,76 +287,76 @@
           <w:szCs w:val="32"/>
           <w:lang w:val="fr-FR"/>
         </w:rPr>
-        <w:t>delay</w:t>
-      </w:r>
-      <w:proofErr w:type="spellEnd"/>
-    </w:p>
-    <w:p>
-      <w:pPr>
-        <w:rPr>
-          <w:lang w:val="fr-FR"/>
-        </w:rPr>
-      </w:pPr>
-      <w:r>
-        <w:rPr>
-          <w:lang w:val="fr-FR"/>
-        </w:rPr>
-        <w:t>Pour répondre à l'objectif des fonctionnalités avancées, j'ai introduit un premier processeur d'effets :</w:t>
-      </w:r>
-    </w:p>
-    <w:p>
-      <w:pPr>
-        <w:rPr>
-          <w:lang w:val="fr-FR"/>
-        </w:rPr>
-      </w:pPr>
-      <w:r>
-        <w:rPr>
-          <w:lang w:val="fr-FR"/>
-        </w:rPr>
-        <w:t>- Traitement temporel : Le moteur audio a été modifié pour intégrer une ligne de retard (Delay). L'algorithme consiste à créer un buffer circulaire où une partie du signal de sortie est réinjectée (feedback) avec un décalage et une atténuation.</w:t>
-      </w:r>
-    </w:p>
-    <w:p>
-      <w:pPr>
-        <w:rPr>
-          <w:lang w:val="fr-FR"/>
-        </w:rPr>
-      </w:pPr>
-      <w:r>
-        <w:rPr>
-          <w:lang w:val="fr-FR"/>
-        </w:rPr>
-        <w:t xml:space="preserve">- Contrôle UI : Un nouveau </w:t>
-      </w:r>
-      <w:proofErr w:type="spellStart"/>
-      <w:r>
-        <w:rPr>
-          <w:lang w:val="fr-FR"/>
-        </w:rPr>
-        <w:t>slider</w:t>
-      </w:r>
-      <w:proofErr w:type="spellEnd"/>
-      <w:r>
-        <w:rPr>
-          <w:lang w:val="fr-FR"/>
-        </w:rPr>
-        <w:t xml:space="preserve"> a été ajouté à l'interface graphique pour permettre à l'utilisateur de doser l'intensité de l'écho en temps réel, sans interrompre la boucle de lecture gérée par le </w:t>
-      </w:r>
-      <w:proofErr w:type="spellStart"/>
-      <w:r>
-        <w:rPr>
-          <w:lang w:val="fr-FR"/>
-        </w:rPr>
-        <w:t>QTimer</w:t>
-      </w:r>
-      <w:proofErr w:type="spellEnd"/>
-      <w:r>
-        <w:rPr>
-          <w:lang w:val="fr-FR"/>
-        </w:rPr>
-        <w:t>.</w:t>
-      </w:r>
+      </w:pPr>
+      <w:r>
+        <w:rPr>
+          <w:rFonts w:asciiTheme="majorHAnsi" w:eastAsiaTheme="majorEastAsia" w:hAnsiTheme="majorHAnsi" w:cstheme="majorBidi"/>
+          <w:color w:val="0F4761" w:themeColor="accent1" w:themeShade="BF"/>
+          <w:sz w:val="32"/>
+          <w:szCs w:val="32"/>
+          <w:lang w:val="fr-FR"/>
+        </w:rPr>
+        <w:lastRenderedPageBreak/>
+        <w:t>Finalisation de la persistance et Qualité du code</w:t>
+      </w:r>
+    </w:p>
+    <w:p>
+      <w:pPr>
+        <w:rPr>
+          <w:lang w:val="fr-FR"/>
+        </w:rPr>
+      </w:pPr>
+      <w:r>
+        <w:rPr>
+          <w:lang w:val="fr-FR"/>
+        </w:rPr>
+        <w:t>Le système de sauvegarde JSON implémenté en février a été enrichi pour supporter les nouvelles fonctionnalités.</w:t>
+      </w:r>
+    </w:p>
+    <w:p>
+      <w:pPr>
+        <w:rPr>
+          <w:lang w:val="fr-FR"/>
+        </w:rPr>
+      </w:pPr>
+      <w:r>
+        <w:rPr>
+          <w:lang w:val="fr-FR"/>
+        </w:rPr>
+        <w:t>-</w:t>
+      </w:r>
+      <w:r>
+        <w:rPr>
+          <w:lang w:val="fr-FR"/>
+        </w:rPr>
+        <w:t xml:space="preserve">  Synchronisation complète : Les fichiers de projet enregistrent désormais l'état des 64 pas, le volume, le tempo, ainsi que l'intensité des effets (Delay et Filtre). </w:t>
+      </w:r>
+    </w:p>
+    <w:p>
+      <w:pPr>
+        <w:rPr>
+          <w:lang w:val="fr-FR"/>
+        </w:rPr>
+      </w:pPr>
+      <w:r>
+        <w:rPr>
+          <w:lang w:val="fr-FR"/>
+        </w:rPr>
+        <w:t xml:space="preserve">- </w:t>
+      </w:r>
+      <w:r>
+        <w:rPr>
+          <w:lang w:val="fr-FR"/>
+        </w:rPr>
+        <w:t>Documentation technique : Conformément à la démarche de janvier, j'ai harmonisé l'intégralité du code source. Les commentaires superflus ont été remplacés par des docstrings standardisées décrivant précisément chaque fonction et ses arguments, assurant la maintenabilité du projet.</w:t>
+      </w:r>
+    </w:p>
+    <w:p>
+      <w:pPr>
+        <w:rPr>
+          <w:lang w:val="fr-FR"/>
+        </w:rPr>
+      </w:pPr>
     </w:p>
     <w:p>
       <w:pPr>
@@ -391,7 +369,6 @@
         <w:rPr>
           <w:lang w:val="fr-FR"/>
         </w:rPr>
-        <w:lastRenderedPageBreak/>
         <w:t>Conclusion</w:t>
       </w:r>
     </w:p>
@@ -405,64 +382,34 @@
         <w:rPr>
           <w:lang w:val="fr-FR"/>
         </w:rPr>
-        <w:t xml:space="preserve">Le mois de mars marque la fin du développement des fonctionnalités majeures. Le logiciel remplit désormais toutes les conditions d'un séquenceur moderne : gestion de motifs </w:t>
-      </w:r>
-      <w:proofErr w:type="gramStart"/>
-      <w:r>
-        <w:rPr>
-          <w:lang w:val="fr-FR"/>
-        </w:rPr>
-        <w:t>rythmiques ,</w:t>
-      </w:r>
-      <w:proofErr w:type="gramEnd"/>
-      <w:r>
-        <w:rPr>
-          <w:lang w:val="fr-FR"/>
-        </w:rPr>
-        <w:t xml:space="preserve"> polyphonie illimitée via </w:t>
-      </w:r>
-      <w:proofErr w:type="spellStart"/>
-      <w:proofErr w:type="gramStart"/>
-      <w:r>
-        <w:rPr>
-          <w:lang w:val="fr-FR"/>
-        </w:rPr>
-        <w:t>NumPy</w:t>
-      </w:r>
-      <w:proofErr w:type="spellEnd"/>
-      <w:r>
-        <w:rPr>
-          <w:lang w:val="fr-FR"/>
-        </w:rPr>
-        <w:t xml:space="preserve"> ,</w:t>
-      </w:r>
-      <w:proofErr w:type="gramEnd"/>
-      <w:r>
-        <w:rPr>
-          <w:lang w:val="fr-FR"/>
-        </w:rPr>
-        <w:t xml:space="preserve"> persistance des données via JSON et désormais, exportation et effets. Le mois d'avril sera dédié à la stabilisation finale du code, </w:t>
-      </w:r>
-      <w:proofErr w:type="gramStart"/>
-      <w:r>
-        <w:rPr>
-          <w:lang w:val="fr-FR"/>
-        </w:rPr>
-        <w:t>l’ajout</w:t>
-      </w:r>
-      <w:proofErr w:type="gramEnd"/>
-      <w:r>
-        <w:rPr>
-          <w:lang w:val="fr-FR"/>
-        </w:rPr>
-        <w:t xml:space="preserve"> de toutes dernières fonctionnalités, </w:t>
-      </w:r>
-      <w:r>
-        <w:rPr>
-          <w:lang w:val="fr-FR"/>
-        </w:rPr>
-        <w:t>à la correction d'éventuels bugs et à la préparation de la documentation de livraison.</w:t>
-      </w:r>
+        <w:t xml:space="preserve">Les objectifs finaux sont pleinement atteints. Le logiciel est passé d'un simple script de lecture en octobre à un séquenceur multipiste </w:t>
+      </w:r>
+      <w:r>
+        <w:rPr>
+          <w:lang w:val="fr-FR"/>
+        </w:rPr>
+        <w:t>stable</w:t>
+      </w:r>
+      <w:r>
+        <w:rPr>
+          <w:lang w:val="fr-FR"/>
+        </w:rPr>
+        <w:t>. Grâce à l'architecture asynchrone et au mixage NumPy, le moteur audio supporte désormais des rythmes complexes sur 64 temps avec des effets en temps réel sans aucune latence.</w:t>
+      </w:r>
+    </w:p>
+    <w:p>
+      <w:pPr>
+        <w:rPr>
+          <w:lang w:val="fr-FR"/>
+        </w:rPr>
+      </w:pPr>
+    </w:p>
+    <w:p>
+      <w:pPr>
+        <w:rPr>
+          <w:lang w:val="fr-FR"/>
+        </w:rPr>
+      </w:pPr>
     </w:p>
     <w:sectPr>
       <w:headerReference w:type="default" r:id="rId8"/>
@@ -1601,7 +1548,6 @@
   <w:style w:type="character" w:default="1" w:styleId="Policepardfaut">
     <w:name w:val="Default Paragraph Font"/>
     <w:uiPriority w:val="1"/>
-    <w:semiHidden/>
     <w:unhideWhenUsed/>
   </w:style>
   <w:style w:type="table" w:default="1" w:styleId="TableauNormal">
@@ -1991,6 +1937,17 @@
     <w:rPr>
       <w:color w:val="96607D" w:themeColor="followedHyperlink"/>
       <w:u w:val="single"/>
+    </w:rPr>
+  </w:style>
+  <w:style w:type="paragraph" w:styleId="NormalWeb">
+    <w:name w:val="Normal (Web)"/>
+    <w:basedOn w:val="Normal"/>
+    <w:uiPriority w:val="99"/>
+    <w:semiHidden/>
+    <w:unhideWhenUsed/>
+    <w:rsid w:val="00833BBA"/>
+    <w:rPr>
+      <w:rFonts w:ascii="Times New Roman" w:hAnsi="Times New Roman" w:cs="Times New Roman"/>
     </w:rPr>
   </w:style>
 </w:styles>

</xml_diff>